<commit_message>
Added Gantt chart and project estimated budget
</commit_message>
<xml_diff>
--- a/docs/uni-submission/mid-semeter report.docx
+++ b/docs/uni-submission/mid-semeter report.docx
@@ -286,6 +286,30 @@
           <w:b/>
           <w:bCs/>
         </w:rPr>
+        <w:t>Academic Year:</w:t>
+        <w:tab/>
+        <w:tab/>
+        <w:t xml:space="preserve">     2025/2026</w:t>
+      </w:r>
+    </w:p>
+    <w:p>
+      <w:pPr>
+        <w:pStyle w:val="Normal"/>
+        <w:bidi w:val="0"/>
+        <w:spacing w:lineRule="auto" w:line="480"/>
+        <w:jc w:val="start"/>
+        <w:rPr>
+          <w:rFonts w:ascii="Times New Roman" w:hAnsi="Times New Roman"/>
+          <w:b/>
+          <w:bCs/>
+        </w:rPr>
+      </w:pPr>
+      <w:r>
+        <w:rPr>
+          <w:rFonts w:ascii="Times New Roman" w:hAnsi="Times New Roman"/>
+          <w:b/>
+          <w:bCs/>
+        </w:rPr>
       </w:r>
       <w:r>
         <w:br w:type="page"/>
@@ -550,12 +574,32 @@
             </w:tabs>
             <w:rPr/>
           </w:pPr>
-          <w:hyperlink w:anchor="__RefHeading___Toc2942_3810426074" w:tooltip="1.5 SCOPE AND LIMITATIONS">
+          <w:hyperlink w:anchor="__RefHeading___Toc381_3821115646" w:tooltip="1.5 SIGNIFICANCE OF STUDY">
             <w:r>
               <w:rPr>
                 <w:rStyle w:val="IndexLink"/>
               </w:rPr>
-              <w:t>1.5 SCOPE AND LIMITATIONS</w:t>
+              <w:t>1.5 SIGNIFICANCE OF STUDY</w:t>
+              <w:tab/>
+              <w:t>2</w:t>
+            </w:r>
+          </w:hyperlink>
+        </w:p>
+        <w:p>
+          <w:pPr>
+            <w:pStyle w:val="TOC2"/>
+            <w:tabs>
+              <w:tab w:val="clear" w:pos="9355"/>
+              <w:tab w:val="right" w:pos="9637" w:leader="dot"/>
+            </w:tabs>
+            <w:rPr/>
+          </w:pPr>
+          <w:hyperlink w:anchor="__RefHeading___Toc2942_3810426074" w:tooltip="1.6 SCOPE AND LIMITATIONS">
+            <w:r>
+              <w:rPr>
+                <w:rStyle w:val="IndexLink"/>
+              </w:rPr>
+              <w:t>1.6 SCOPE AND LIMITATIONS</w:t>
               <w:tab/>
               <w:t>2</w:t>
             </w:r>
@@ -677,7 +721,7 @@
               </w:rPr>
               <w:t>3.2 FUNCTIONAL WORKFLOW</w:t>
               <w:tab/>
-              <w:t>4</w:t>
+              <w:t>5</w:t>
             </w:r>
           </w:hyperlink>
         </w:p>
@@ -723,6 +767,46 @@
         </w:p>
         <w:p>
           <w:pPr>
+            <w:pStyle w:val="TOC2"/>
+            <w:tabs>
+              <w:tab w:val="clear" w:pos="9355"/>
+              <w:tab w:val="right" w:pos="9637" w:leader="dot"/>
+            </w:tabs>
+            <w:rPr/>
+          </w:pPr>
+          <w:hyperlink w:anchor="__RefHeading___Toc388_1175120669" w:tooltip="3.5 PROJECT SCHEDULE">
+            <w:r>
+              <w:rPr>
+                <w:rStyle w:val="IndexLink"/>
+              </w:rPr>
+              <w:t>3.5 PROJECT SCHEDULE</w:t>
+              <w:tab/>
+              <w:t>6</w:t>
+            </w:r>
+          </w:hyperlink>
+        </w:p>
+        <w:p>
+          <w:pPr>
+            <w:pStyle w:val="TOC2"/>
+            <w:tabs>
+              <w:tab w:val="clear" w:pos="9355"/>
+              <w:tab w:val="right" w:pos="9637" w:leader="dot"/>
+            </w:tabs>
+            <w:rPr/>
+          </w:pPr>
+          <w:hyperlink w:anchor="__RefHeading___Toc386_1175120669" w:tooltip="3.6 PROJECT BUDGET">
+            <w:r>
+              <w:rPr>
+                <w:rStyle w:val="IndexLink"/>
+              </w:rPr>
+              <w:t>3.6 PROJECT BUDGET</w:t>
+              <w:tab/>
+              <w:t>7</w:t>
+            </w:r>
+          </w:hyperlink>
+        </w:p>
+        <w:p>
+          <w:pPr>
             <w:pStyle w:val="TOC1"/>
             <w:tabs>
               <w:tab w:val="clear" w:pos="9638"/>
@@ -737,7 +821,7 @@
               </w:rPr>
               <w:t>REFERENCES</w:t>
               <w:tab/>
-              <w:t>7</w:t>
+              <w:t>8</w:t>
             </w:r>
           </w:hyperlink>
           <w:r>
@@ -769,7 +853,7 @@
           <w:ilvl w:val="0"/>
           <w:numId w:val="0"/>
         </w:numPr>
-        <w:spacing w:before="0" w:after="140"/>
+        <w:spacing w:before="0" w:after="0"/>
         <w:ind w:hanging="0" w:start="0"/>
         <w:rPr/>
       </w:pPr>
@@ -1918,15 +2002,7 @@
       </w:pPr>
       <w:r>
         <w:rPr/>
-        <w:t xml:space="preserve">Design and implementation of an Automated ID Card Issuance System for pre-printed student ID cards with secure authentication </w:t>
-      </w:r>
-      <w:r>
-        <w:rPr/>
-        <w:t xml:space="preserve">and audit logging </w:t>
-      </w:r>
-      <w:r>
-        <w:rPr/>
-        <w:t>while serving students at all times.</w:t>
+        <w:t>Design and implementation of an Automated ID Card Issuance System for pre-printed student ID cards with secure authentication and audit logging while serving students at all times.</w:t>
       </w:r>
     </w:p>
     <w:p>
@@ -1999,11 +2075,7 @@
       </w:pPr>
       <w:r>
         <w:rPr/>
-        <w:t>To i</w:t>
-      </w:r>
-      <w:r>
-        <w:rPr/>
-        <w:t>mplement security policy that uses SMS-delivered OTPs as authentication mechanism, and also enforce measures to deal with invalid attempts and communication to system admin.</w:t>
+        <w:t>To implement security policy that uses SMS-delivered OTPs as authentication mechanism, and also enforce measures to deal with invalid attempts and communication to system admin.</w:t>
       </w:r>
     </w:p>
     <w:p>
@@ -2017,11 +2089,7 @@
       </w:pPr>
       <w:r>
         <w:rPr/>
-        <w:t>To e</w:t>
-      </w:r>
-      <w:r>
-        <w:rPr/>
-        <w:t>valuate system performance using metrics such as average card retrieval time, authentication success, error handling and dispense rate.</w:t>
+        <w:t>To evaluate system performance using metrics such as average card retrieval time, authentication success, error handling and dispense rate.</w:t>
       </w:r>
     </w:p>
     <w:p>
@@ -2035,11 +2103,7 @@
       </w:pPr>
       <w:r>
         <w:rPr/>
-        <w:t>To p</w:t>
-      </w:r>
-      <w:r>
-        <w:rPr/>
-        <w:t>roduce a formal report involving design of the prototype and various milestones.</w:t>
+        <w:t>To produce a formal report involving design of the prototype and various milestones.</w:t>
       </w:r>
     </w:p>
     <w:p>
@@ -2052,11 +2116,108 @@
         <w:ind w:hanging="0" w:start="0"/>
         <w:rPr/>
       </w:pPr>
-      <w:bookmarkStart w:id="10" w:name="__RefHeading___Toc2942_3810426074"/>
+      <w:bookmarkStart w:id="10" w:name="__RefHeading___Toc381_3821115646"/>
       <w:bookmarkEnd w:id="10"/>
       <w:r>
         <w:rPr/>
-        <w:t>1.5 SCOPE AND LIMITATIONS</w:t>
+        <w:t>1.5 SIGNIFICANCE OF STUDY</w:t>
+      </w:r>
+    </w:p>
+    <w:p>
+      <w:pPr>
+        <w:pStyle w:val="BodyText"/>
+        <w:widowControl/>
+        <w:numPr>
+          <w:ilvl w:val="0"/>
+          <w:numId w:val="8"/>
+        </w:numPr>
+        <w:suppressAutoHyphens w:val="true"/>
+        <w:bidi w:val="0"/>
+        <w:spacing w:lineRule="auto" w:line="360" w:before="0" w:after="140"/>
+        <w:ind w:hanging="0" w:start="360" w:end="0"/>
+        <w:jc w:val="both"/>
+        <w:rPr/>
+      </w:pPr>
+      <w:r>
+        <w:rPr/>
+        <w:t>Operational efficiency: the proposed system reduces long queues and waiting times by allowing students to retrieve ID cards on demand without any staff intervention.</w:t>
+      </w:r>
+    </w:p>
+    <w:p>
+      <w:pPr>
+        <w:pStyle w:val="BodyText"/>
+        <w:widowControl/>
+        <w:numPr>
+          <w:ilvl w:val="0"/>
+          <w:numId w:val="8"/>
+        </w:numPr>
+        <w:suppressAutoHyphens w:val="true"/>
+        <w:bidi w:val="0"/>
+        <w:spacing w:lineRule="auto" w:line="360" w:before="0" w:after="140"/>
+        <w:ind w:hanging="0" w:start="360" w:end="0"/>
+        <w:jc w:val="both"/>
+        <w:rPr/>
+      </w:pPr>
+      <w:r>
+        <w:rPr/>
+        <w:t>Reduced administrative burden: the system performs automation which replaces the repetitive tasks done by a university staff allowing them to focus on higher level tasks.</w:t>
+      </w:r>
+    </w:p>
+    <w:p>
+      <w:pPr>
+        <w:pStyle w:val="BodyText"/>
+        <w:widowControl/>
+        <w:numPr>
+          <w:ilvl w:val="0"/>
+          <w:numId w:val="8"/>
+        </w:numPr>
+        <w:suppressAutoHyphens w:val="true"/>
+        <w:bidi w:val="0"/>
+        <w:spacing w:lineRule="auto" w:line="360" w:before="0" w:after="140"/>
+        <w:ind w:hanging="0" w:start="360" w:end="0"/>
+        <w:jc w:val="both"/>
+        <w:rPr/>
+      </w:pPr>
+      <w:r>
+        <w:rPr/>
+        <w:t>Scalability, accessibility and replicability: Although the proposed system is implemented as a prototype for UDSM, the system can be adopted by other institutions for applications. Also, access to students retrieving their ID cards beyond standard normal working hours.</w:t>
+      </w:r>
+    </w:p>
+    <w:p>
+      <w:pPr>
+        <w:pStyle w:val="BodyText"/>
+        <w:widowControl/>
+        <w:numPr>
+          <w:ilvl w:val="0"/>
+          <w:numId w:val="8"/>
+        </w:numPr>
+        <w:suppressAutoHyphens w:val="true"/>
+        <w:bidi w:val="0"/>
+        <w:spacing w:lineRule="auto" w:line="360" w:before="0" w:after="140"/>
+        <w:ind w:hanging="0" w:start="360" w:end="0"/>
+        <w:jc w:val="both"/>
+        <w:rPr/>
+      </w:pPr>
+      <w:r>
+        <w:rPr/>
+        <w:t>Academic contribution: the project demonstrates practical application of embedded systems, back-end software and other mechanical design theory and automation studied as theory in various academic year.</w:t>
+      </w:r>
+    </w:p>
+    <w:p>
+      <w:pPr>
+        <w:pStyle w:val="Heading2"/>
+        <w:numPr>
+          <w:ilvl w:val="1"/>
+          <w:numId w:val="1"/>
+        </w:numPr>
+        <w:ind w:hanging="0" w:start="0"/>
+        <w:rPr/>
+      </w:pPr>
+      <w:bookmarkStart w:id="11" w:name="__RefHeading___Toc2942_3810426074"/>
+      <w:bookmarkEnd w:id="11"/>
+      <w:r>
+        <w:rPr/>
+        <w:t>1.6 SCOPE AND LIMITATIONS</w:t>
       </w:r>
     </w:p>
     <w:p>
@@ -2113,8 +2274,8 @@
         <w:ind w:hanging="0" w:start="0"/>
         <w:rPr/>
       </w:pPr>
-      <w:bookmarkStart w:id="11" w:name="__RefHeading___Toc2936_3810426074"/>
-      <w:bookmarkEnd w:id="11"/>
+      <w:bookmarkStart w:id="12" w:name="__RefHeading___Toc2936_3810426074"/>
+      <w:bookmarkEnd w:id="12"/>
       <w:r>
         <w:rPr/>
         <w:t>CHAPTER TWO: LITERATURE REVIEW</w:t>
@@ -2140,8 +2301,8 @@
         <w:ind w:hanging="0" w:start="0"/>
         <w:rPr/>
       </w:pPr>
-      <w:bookmarkStart w:id="12" w:name="__RefHeading___Toc2940_3810426074"/>
-      <w:bookmarkEnd w:id="12"/>
+      <w:bookmarkStart w:id="13" w:name="__RefHeading___Toc2940_3810426074"/>
+      <w:bookmarkEnd w:id="13"/>
       <w:r>
         <w:rPr/>
         <w:t>2.1 RELATED TECHNOLOGIES</w:t>
@@ -2199,8 +2360,8 @@
         <w:ind w:hanging="0" w:start="0"/>
         <w:rPr/>
       </w:pPr>
-      <w:bookmarkStart w:id="13" w:name="__RefHeading___Toc2938_3810426074"/>
-      <w:bookmarkEnd w:id="13"/>
+      <w:bookmarkStart w:id="14" w:name="__RefHeading___Toc2938_3810426074"/>
+      <w:bookmarkEnd w:id="14"/>
       <w:r>
         <w:rPr/>
         <w:t>2.2 RESEARCH GAP</w:t>
@@ -2213,11 +2374,7 @@
       </w:pPr>
       <w:r>
         <w:rPr/>
-        <w:t xml:space="preserve">From the related projects, the proposed system aims to cover the gap that </w:t>
-      </w:r>
-      <w:r>
-        <w:rPr/>
-        <w:t>despite an extensive research on vending and kiosk systems, limited work addresses secure automated distribution of pre-printed identification cards particularly in University environments.</w:t>
+        <w:t>From the related projects, the proposed system aims to cover the gap that despite an extensive research on vending and kiosk systems, limited work addresses secure automated distribution of pre-printed identification cards particularly in University environments.</w:t>
       </w:r>
       <w:r>
         <w:br w:type="page"/>
@@ -2234,8 +2391,8 @@
         <w:ind w:hanging="0" w:start="0"/>
         <w:rPr/>
       </w:pPr>
-      <w:bookmarkStart w:id="14" w:name="__RefHeading___Toc3054_3810426074"/>
-      <w:bookmarkEnd w:id="14"/>
+      <w:bookmarkStart w:id="15" w:name="__RefHeading___Toc3054_3810426074"/>
+      <w:bookmarkEnd w:id="15"/>
       <w:r>
         <w:rPr/>
         <w:t>CHAPTER THREE: METHODOLOGY</w:t>
@@ -2261,8 +2418,8 @@
         <w:ind w:hanging="0" w:start="0"/>
         <w:rPr/>
       </w:pPr>
-      <w:bookmarkStart w:id="15" w:name="__RefHeading___Toc3062_3810426074"/>
-      <w:bookmarkEnd w:id="15"/>
+      <w:bookmarkStart w:id="16" w:name="__RefHeading___Toc3062_3810426074"/>
+      <w:bookmarkEnd w:id="16"/>
       <w:r>
         <w:rPr/>
         <w:t>3.1 SYSTEM ARCHITECTURE</w:t>
@@ -2291,20 +2448,73 @@
     <w:p>
       <w:pPr>
         <w:pStyle w:val="BodyText"/>
+        <w:rPr/>
+      </w:pPr>
+      <w:r>
+        <w:rPr/>
+        <w:drawing>
+          <wp:anchor behindDoc="0" distT="0" distB="0" distL="0" distR="0" simplePos="0" locked="0" layoutInCell="0" allowOverlap="1" relativeHeight="3">
+            <wp:simplePos x="0" y="0"/>
+            <wp:positionH relativeFrom="column">
+              <wp:align>center</wp:align>
+            </wp:positionH>
+            <wp:positionV relativeFrom="paragraph">
+              <wp:posOffset>635</wp:posOffset>
+            </wp:positionV>
+            <wp:extent cx="5617845" cy="4488180"/>
+            <wp:effectExtent l="0" t="0" r="0" b="0"/>
+            <wp:wrapSquare wrapText="largest"/>
+            <wp:docPr id="2" name="Image2"/>
+            <wp:cNvGraphicFramePr>
+              <a:graphicFrameLocks xmlns:a="http://schemas.openxmlformats.org/drawingml/2006/main" noChangeAspect="1"/>
+            </wp:cNvGraphicFramePr>
+            <a:graphic xmlns:a="http://schemas.openxmlformats.org/drawingml/2006/main">
+              <a:graphicData uri="http://schemas.openxmlformats.org/drawingml/2006/picture">
+                <pic:pic xmlns:pic="http://schemas.openxmlformats.org/drawingml/2006/picture">
+                  <pic:nvPicPr>
+                    <pic:cNvPr id="2" name="Image2"/>
+                    <pic:cNvPicPr>
+                      <a:picLocks noChangeAspect="1" noChangeArrowheads="1"/>
+                    </pic:cNvPicPr>
+                  </pic:nvPicPr>
+                  <pic:blipFill>
+                    <a:blip r:embed="rId6"/>
+                    <a:stretch>
+                      <a:fillRect/>
+                    </a:stretch>
+                  </pic:blipFill>
+                  <pic:spPr bwMode="auto">
+                    <a:xfrm>
+                      <a:off x="0" y="0"/>
+                      <a:ext cx="5617845" cy="4488180"/>
+                    </a:xfrm>
+                    <a:prstGeom prst="rect">
+                      <a:avLst/>
+                    </a:prstGeom>
+                    <a:noFill/>
+                  </pic:spPr>
+                </pic:pic>
+              </a:graphicData>
+            </a:graphic>
+          </wp:anchor>
+        </w:drawing>
+      </w:r>
+    </w:p>
+    <w:p>
+      <w:pPr>
+        <w:pStyle w:val="BodyText"/>
+        <w:jc w:val="center"/>
         <w:rPr>
-          <w:b/>
-          <w:bCs/>
-          <w:highlight w:val="none"/>
-          <w:shd w:fill="FF0000" w:val="clear"/>
+          <w:i/>
+          <w:iCs/>
         </w:rPr>
       </w:pPr>
       <w:r>
         <w:rPr>
-          <w:b/>
-          <w:bCs/>
-          <w:shd w:fill="FF0000" w:val="clear"/>
+          <w:i/>
+          <w:iCs/>
         </w:rPr>
-        <w:t>ADD A BLOCK DIAGRAM!</w:t>
+        <w:t>System’s block diagram</w:t>
       </w:r>
     </w:p>
     <w:p>
@@ -2317,8 +2527,8 @@
         <w:ind w:hanging="0" w:start="0"/>
         <w:rPr/>
       </w:pPr>
-      <w:bookmarkStart w:id="16" w:name="__RefHeading___Toc3060_3810426074"/>
-      <w:bookmarkEnd w:id="16"/>
+      <w:bookmarkStart w:id="17" w:name="__RefHeading___Toc3060_3810426074"/>
+      <w:bookmarkEnd w:id="17"/>
       <w:r>
         <w:rPr/>
         <w:t>3.2 FUNCTIONAL WORKFLOW</w:t>
@@ -2390,8 +2600,8 @@
         <w:ind w:hanging="0" w:start="0"/>
         <w:rPr/>
       </w:pPr>
-      <w:bookmarkStart w:id="17" w:name="__RefHeading___Toc3058_3810426074"/>
-      <w:bookmarkEnd w:id="17"/>
+      <w:bookmarkStart w:id="18" w:name="__RefHeading___Toc3058_3810426074"/>
+      <w:bookmarkEnd w:id="18"/>
       <w:r>
         <w:rPr/>
         <w:t>3.3 COMMUNICATION PROTOCOL</w:t>
@@ -2427,8 +2637,8 @@
         <w:ind w:hanging="0" w:start="0"/>
         <w:rPr/>
       </w:pPr>
-      <w:bookmarkStart w:id="18" w:name="__RefHeading___Toc3056_3810426074"/>
-      <w:bookmarkEnd w:id="18"/>
+      <w:bookmarkStart w:id="19" w:name="__RefHeading___Toc3056_3810426074"/>
+      <w:bookmarkEnd w:id="19"/>
       <w:r>
         <w:rPr/>
         <w:t>3.4 HARDWARE AND TOOLS USED</w:t>
@@ -2455,7 +2665,7 @@
       </w:pPr>
       <w:r>
         <w:rPr/>
-        <w:t>Raspberry Pi 5 – hosts back-end application, OTP generation, database access, logging, computer vision and communication with STM32.</w:t>
+        <w:t>Raspberry Pi 5 – hosts back-end application, OTP generation, database access, logging, computer vision and communication with low-level controller.</w:t>
       </w:r>
     </w:p>
     <w:p>
@@ -2469,7 +2679,7 @@
       </w:pPr>
       <w:r>
         <w:rPr/>
-        <w:t>STM32 board – directly drives actuators, reads sensors, timing and safety logic, detects mechanical faults and reports status to Raspberry Pi</w:t>
+        <w:t>Low-level controller – directly drives actuators, reads sensors, timing and safety logic, detects mechanical faults and reports status to Raspberry Pi.</w:t>
       </w:r>
     </w:p>
     <w:p>
@@ -2577,7 +2787,7 @@
       </w:pPr>
       <w:r>
         <w:rPr/>
-        <w:t>Back-end Application – handles user input, authentication, interfaces with database, sends commands to STM32 and manages error handling.</w:t>
+        <w:t>Back-end Application – handles user input, authentication, interfaces with database, sends commands to low-level controller and manages error handling.</w:t>
       </w:r>
     </w:p>
     <w:p>
@@ -2619,7 +2829,1270 @@
       </w:pPr>
       <w:r>
         <w:rPr/>
-        <w:t>STM32 Firmware – executes motor control routines, reads sensors, implements communication and monitors safety.</w:t>
+        <w:t>Low-level controller Firmware – executes motor control routines, reads sensors, implements communication and monitors safety.</w:t>
+      </w:r>
+    </w:p>
+    <w:p>
+      <w:pPr>
+        <w:pStyle w:val="Heading2"/>
+        <w:numPr>
+          <w:ilvl w:val="1"/>
+          <w:numId w:val="1"/>
+        </w:numPr>
+        <w:ind w:hanging="0" w:start="0"/>
+        <w:rPr/>
+      </w:pPr>
+      <w:bookmarkStart w:id="20" w:name="__RefHeading___Toc388_1175120669"/>
+      <w:bookmarkEnd w:id="20"/>
+      <w:r>
+        <w:rPr/>
+        <w:t>3.5 PROJECT SCHEDULE</w:t>
+      </w:r>
+    </w:p>
+    <w:p>
+      <w:pPr>
+        <w:pStyle w:val="BodyText"/>
+        <w:rPr/>
+      </w:pPr>
+      <w:r>
+        <w:drawing>
+          <wp:anchor behindDoc="0" distT="0" distB="0" distL="0" distR="0" simplePos="0" locked="0" layoutInCell="0" allowOverlap="1" relativeHeight="4">
+            <wp:simplePos x="0" y="0"/>
+            <wp:positionH relativeFrom="column">
+              <wp:posOffset>-4445</wp:posOffset>
+            </wp:positionH>
+            <wp:positionV relativeFrom="paragraph">
+              <wp:posOffset>324485</wp:posOffset>
+            </wp:positionV>
+            <wp:extent cx="5951855" cy="3086100"/>
+            <wp:effectExtent l="0" t="0" r="0" b="0"/>
+            <wp:wrapTopAndBottom/>
+            <wp:docPr id="3" name="Image3"/>
+            <wp:cNvGraphicFramePr>
+              <a:graphicFrameLocks xmlns:a="http://schemas.openxmlformats.org/drawingml/2006/main" noChangeAspect="1"/>
+            </wp:cNvGraphicFramePr>
+            <a:graphic xmlns:a="http://schemas.openxmlformats.org/drawingml/2006/main">
+              <a:graphicData uri="http://schemas.openxmlformats.org/drawingml/2006/picture">
+                <pic:pic xmlns:pic="http://schemas.openxmlformats.org/drawingml/2006/picture">
+                  <pic:nvPicPr>
+                    <pic:cNvPr id="3" name="Image3"/>
+                    <pic:cNvPicPr>
+                      <a:picLocks noChangeAspect="1" noChangeArrowheads="1"/>
+                    </pic:cNvPicPr>
+                  </pic:nvPicPr>
+                  <pic:blipFill>
+                    <a:blip r:embed="rId7"/>
+                    <a:stretch>
+                      <a:fillRect/>
+                    </a:stretch>
+                  </pic:blipFill>
+                  <pic:spPr bwMode="auto">
+                    <a:xfrm>
+                      <a:off x="0" y="0"/>
+                      <a:ext cx="5951855" cy="3086100"/>
+                    </a:xfrm>
+                    <a:prstGeom prst="rect">
+                      <a:avLst/>
+                    </a:prstGeom>
+                    <a:noFill/>
+                  </pic:spPr>
+                </pic:pic>
+              </a:graphicData>
+            </a:graphic>
+          </wp:anchor>
+        </w:drawing>
+      </w:r>
+      <w:r>
+        <w:rPr/>
+        <w:t>For first semester, the following Gantt chart shows various activities planned for proposed system:</w:t>
+      </w:r>
+    </w:p>
+    <w:p>
+      <w:pPr>
+        <w:pStyle w:val="BodyText"/>
+        <w:rPr/>
+      </w:pPr>
+      <w:r>
+        <w:rPr/>
+      </w:r>
+    </w:p>
+    <w:p>
+      <w:pPr>
+        <w:pStyle w:val="BodyText"/>
+        <w:rPr/>
+      </w:pPr>
+      <w:r>
+        <w:rPr/>
+        <w:t>For second semester, the following Gantt chart shows various activities planned for proposed system:</w:t>
+      </w:r>
+    </w:p>
+    <w:p>
+      <w:pPr>
+        <w:pStyle w:val="BodyText"/>
+        <w:jc w:val="center"/>
+        <w:rPr>
+          <w:i/>
+          <w:iCs/>
+        </w:rPr>
+      </w:pPr>
+      <w:r>
+        <w:drawing>
+          <wp:anchor behindDoc="0" distT="0" distB="0" distL="0" distR="0" simplePos="0" locked="0" layoutInCell="0" allowOverlap="1" relativeHeight="5">
+            <wp:simplePos x="0" y="0"/>
+            <wp:positionH relativeFrom="column">
+              <wp:align>center</wp:align>
+            </wp:positionH>
+            <wp:positionV relativeFrom="paragraph">
+              <wp:posOffset>635</wp:posOffset>
+            </wp:positionV>
+            <wp:extent cx="6120130" cy="3108325"/>
+            <wp:effectExtent l="0" t="0" r="0" b="0"/>
+            <wp:wrapTopAndBottom/>
+            <wp:docPr id="4" name="Image4"/>
+            <wp:cNvGraphicFramePr>
+              <a:graphicFrameLocks xmlns:a="http://schemas.openxmlformats.org/drawingml/2006/main" noChangeAspect="1"/>
+            </wp:cNvGraphicFramePr>
+            <a:graphic xmlns:a="http://schemas.openxmlformats.org/drawingml/2006/main">
+              <a:graphicData uri="http://schemas.openxmlformats.org/drawingml/2006/picture">
+                <pic:pic xmlns:pic="http://schemas.openxmlformats.org/drawingml/2006/picture">
+                  <pic:nvPicPr>
+                    <pic:cNvPr id="4" name="Image4"/>
+                    <pic:cNvPicPr>
+                      <a:picLocks noChangeAspect="1" noChangeArrowheads="1"/>
+                    </pic:cNvPicPr>
+                  </pic:nvPicPr>
+                  <pic:blipFill>
+                    <a:blip r:embed="rId8"/>
+                    <a:stretch>
+                      <a:fillRect/>
+                    </a:stretch>
+                  </pic:blipFill>
+                  <pic:spPr bwMode="auto">
+                    <a:xfrm>
+                      <a:off x="0" y="0"/>
+                      <a:ext cx="6120130" cy="3108325"/>
+                    </a:xfrm>
+                    <a:prstGeom prst="rect">
+                      <a:avLst/>
+                    </a:prstGeom>
+                    <a:noFill/>
+                  </pic:spPr>
+                </pic:pic>
+              </a:graphicData>
+            </a:graphic>
+          </wp:anchor>
+        </w:drawing>
+      </w:r>
+      <w:r>
+        <w:rPr>
+          <w:i/>
+          <w:iCs/>
+        </w:rPr>
+        <w:t>Semester 2 - Gantt Chart</w:t>
+      </w:r>
+    </w:p>
+    <w:p>
+      <w:pPr>
+        <w:pStyle w:val="Heading2"/>
+        <w:numPr>
+          <w:ilvl w:val="1"/>
+          <w:numId w:val="1"/>
+        </w:numPr>
+        <w:ind w:hanging="0" w:start="0"/>
+        <w:rPr/>
+      </w:pPr>
+      <w:bookmarkStart w:id="21" w:name="__RefHeading___Toc386_1175120669"/>
+      <w:bookmarkEnd w:id="21"/>
+      <w:r>
+        <w:rPr/>
+        <w:t>3.6 PROJECT BUDGET</w:t>
+      </w:r>
+    </w:p>
+    <w:p>
+      <w:pPr>
+        <w:pStyle w:val="BodyText"/>
+        <w:rPr/>
+      </w:pPr>
+      <w:r>
+        <w:rPr/>
+        <w:t>From the local electronics shops visited, estimated total cost of the proposed system is computed as follows:</w:t>
+      </w:r>
+    </w:p>
+    <w:tbl>
+      <w:tblPr>
+        <w:tblW w:w="5000" w:type="pct"/>
+        <w:jc w:val="start"/>
+        <w:tblInd w:w="-5" w:type="dxa"/>
+        <w:tblLayout w:type="fixed"/>
+        <w:tblCellMar>
+          <w:top w:w="55" w:type="dxa"/>
+          <w:start w:w="55" w:type="dxa"/>
+          <w:bottom w:w="55" w:type="dxa"/>
+          <w:end w:w="55" w:type="dxa"/>
+        </w:tblCellMar>
+      </w:tblPr>
+      <w:tblGrid>
+        <w:gridCol w:w="4819"/>
+        <w:gridCol w:w="4819"/>
+      </w:tblGrid>
+      <w:tr>
+        <w:trPr/>
+        <w:tc>
+          <w:tcPr>
+            <w:tcW w:w="4819" w:type="dxa"/>
+            <w:tcBorders>
+              <w:top w:val="single" w:sz="4" w:space="0" w:color="000000"/>
+              <w:start w:val="single" w:sz="4" w:space="0" w:color="000000"/>
+              <w:bottom w:val="single" w:sz="4" w:space="0" w:color="000000"/>
+            </w:tcBorders>
+          </w:tcPr>
+          <w:p>
+            <w:pPr>
+              <w:pStyle w:val="TableContents"/>
+              <w:jc w:val="center"/>
+              <w:rPr>
+                <w:rFonts w:ascii="Liberation Serif" w:hAnsi="Liberation Serif"/>
+                <w:b/>
+                <w:bCs/>
+                <w:i w:val="false"/>
+                <w:iCs w:val="false"/>
+                <w:strike w:val="false"/>
+                <w:dstrike w:val="false"/>
+                <w:outline w:val="false"/>
+                <w:shadow w:val="false"/>
+                <w:color w:val="000000"/>
+                <w:sz w:val="24"/>
+                <w:szCs w:val="24"/>
+                <w:u w:val="none"/>
+              </w:rPr>
+            </w:pPr>
+            <w:r>
+              <w:rPr>
+                <w:b/>
+                <w:bCs/>
+                <w:i w:val="false"/>
+                <w:iCs w:val="false"/>
+                <w:strike w:val="false"/>
+                <w:dstrike w:val="false"/>
+                <w:outline w:val="false"/>
+                <w:shadow w:val="false"/>
+                <w:color w:val="000000"/>
+                <w:sz w:val="24"/>
+                <w:szCs w:val="24"/>
+                <w:u w:val="none"/>
+              </w:rPr>
+              <w:t>COMPONENT</w:t>
+            </w:r>
+          </w:p>
+        </w:tc>
+        <w:tc>
+          <w:tcPr>
+            <w:tcW w:w="4819" w:type="dxa"/>
+            <w:tcBorders>
+              <w:top w:val="single" w:sz="4" w:space="0" w:color="000000"/>
+              <w:start w:val="single" w:sz="4" w:space="0" w:color="000000"/>
+              <w:bottom w:val="single" w:sz="4" w:space="0" w:color="000000"/>
+              <w:end w:val="single" w:sz="4" w:space="0" w:color="000000"/>
+            </w:tcBorders>
+          </w:tcPr>
+          <w:p>
+            <w:pPr>
+              <w:pStyle w:val="TableContents"/>
+              <w:jc w:val="center"/>
+              <w:rPr>
+                <w:rFonts w:ascii="Liberation Serif" w:hAnsi="Liberation Serif"/>
+                <w:b/>
+                <w:bCs/>
+                <w:i w:val="false"/>
+                <w:iCs w:val="false"/>
+                <w:strike w:val="false"/>
+                <w:dstrike w:val="false"/>
+                <w:outline w:val="false"/>
+                <w:shadow w:val="false"/>
+                <w:color w:val="000000"/>
+                <w:sz w:val="24"/>
+                <w:szCs w:val="24"/>
+                <w:u w:val="none"/>
+              </w:rPr>
+            </w:pPr>
+            <w:r>
+              <w:rPr>
+                <w:b/>
+                <w:bCs/>
+                <w:i w:val="false"/>
+                <w:iCs w:val="false"/>
+                <w:strike w:val="false"/>
+                <w:dstrike w:val="false"/>
+                <w:outline w:val="false"/>
+                <w:shadow w:val="false"/>
+                <w:color w:val="000000"/>
+                <w:sz w:val="24"/>
+                <w:szCs w:val="24"/>
+                <w:u w:val="none"/>
+              </w:rPr>
+              <w:t>ESTIMATED COST (T</w:t>
+            </w:r>
+            <w:r>
+              <w:rPr>
+                <w:b/>
+                <w:bCs/>
+                <w:i w:val="false"/>
+                <w:iCs w:val="false"/>
+                <w:strike w:val="false"/>
+                <w:dstrike w:val="false"/>
+                <w:outline w:val="false"/>
+                <w:shadow w:val="false"/>
+                <w:color w:val="000000"/>
+                <w:sz w:val="24"/>
+                <w:szCs w:val="24"/>
+                <w:u w:val="none"/>
+              </w:rPr>
+              <w:t>SH</w:t>
+            </w:r>
+            <w:r>
+              <w:rPr>
+                <w:b/>
+                <w:bCs/>
+                <w:i w:val="false"/>
+                <w:iCs w:val="false"/>
+                <w:strike w:val="false"/>
+                <w:dstrike w:val="false"/>
+                <w:outline w:val="false"/>
+                <w:shadow w:val="false"/>
+                <w:color w:val="000000"/>
+                <w:sz w:val="24"/>
+                <w:szCs w:val="24"/>
+                <w:u w:val="none"/>
+              </w:rPr>
+              <w:t>)</w:t>
+            </w:r>
+          </w:p>
+        </w:tc>
+      </w:tr>
+      <w:tr>
+        <w:trPr/>
+        <w:tc>
+          <w:tcPr>
+            <w:tcW w:w="4819" w:type="dxa"/>
+            <w:tcBorders>
+              <w:start w:val="single" w:sz="4" w:space="0" w:color="000000"/>
+              <w:bottom w:val="single" w:sz="4" w:space="0" w:color="000000"/>
+            </w:tcBorders>
+          </w:tcPr>
+          <w:p>
+            <w:pPr>
+              <w:pStyle w:val="TableContents"/>
+              <w:jc w:val="center"/>
+              <w:rPr>
+                <w:rFonts w:ascii="Liberation Serif" w:hAnsi="Liberation Serif"/>
+                <w:b w:val="false"/>
+                <w:bCs w:val="false"/>
+                <w:i w:val="false"/>
+                <w:iCs w:val="false"/>
+                <w:strike w:val="false"/>
+                <w:dstrike w:val="false"/>
+                <w:outline w:val="false"/>
+                <w:shadow w:val="false"/>
+                <w:color w:val="000000"/>
+                <w:sz w:val="24"/>
+                <w:szCs w:val="24"/>
+                <w:u w:val="none"/>
+              </w:rPr>
+            </w:pPr>
+            <w:r>
+              <w:rPr>
+                <w:b w:val="false"/>
+                <w:bCs w:val="false"/>
+                <w:i w:val="false"/>
+                <w:iCs w:val="false"/>
+                <w:strike w:val="false"/>
+                <w:dstrike w:val="false"/>
+                <w:outline w:val="false"/>
+                <w:shadow w:val="false"/>
+                <w:color w:val="000000"/>
+                <w:sz w:val="24"/>
+                <w:szCs w:val="24"/>
+                <w:u w:val="none"/>
+              </w:rPr>
+              <w:t>Raspberry Pi 5 (4GB)</w:t>
+            </w:r>
+          </w:p>
+        </w:tc>
+        <w:tc>
+          <w:tcPr>
+            <w:tcW w:w="4819" w:type="dxa"/>
+            <w:tcBorders>
+              <w:start w:val="single" w:sz="4" w:space="0" w:color="000000"/>
+              <w:bottom w:val="single" w:sz="4" w:space="0" w:color="000000"/>
+              <w:end w:val="single" w:sz="4" w:space="0" w:color="000000"/>
+            </w:tcBorders>
+          </w:tcPr>
+          <w:p>
+            <w:pPr>
+              <w:pStyle w:val="TableContents"/>
+              <w:jc w:val="center"/>
+              <w:rPr>
+                <w:rFonts w:ascii="Liberation Serif" w:hAnsi="Liberation Serif"/>
+                <w:b w:val="false"/>
+                <w:bCs w:val="false"/>
+                <w:i w:val="false"/>
+                <w:iCs w:val="false"/>
+                <w:strike w:val="false"/>
+                <w:dstrike w:val="false"/>
+                <w:outline w:val="false"/>
+                <w:shadow w:val="false"/>
+                <w:color w:val="000000"/>
+                <w:sz w:val="24"/>
+                <w:szCs w:val="24"/>
+                <w:u w:val="none"/>
+              </w:rPr>
+            </w:pPr>
+            <w:r>
+              <w:rPr>
+                <w:b w:val="false"/>
+                <w:bCs w:val="false"/>
+                <w:i w:val="false"/>
+                <w:iCs w:val="false"/>
+                <w:strike w:val="false"/>
+                <w:dstrike w:val="false"/>
+                <w:outline w:val="false"/>
+                <w:shadow w:val="false"/>
+                <w:color w:val="000000"/>
+                <w:sz w:val="24"/>
+                <w:szCs w:val="24"/>
+                <w:u w:val="none"/>
+              </w:rPr>
+              <w:t>200,000</w:t>
+            </w:r>
+          </w:p>
+        </w:tc>
+      </w:tr>
+      <w:tr>
+        <w:trPr/>
+        <w:tc>
+          <w:tcPr>
+            <w:tcW w:w="4819" w:type="dxa"/>
+            <w:tcBorders>
+              <w:start w:val="single" w:sz="4" w:space="0" w:color="000000"/>
+              <w:bottom w:val="single" w:sz="4" w:space="0" w:color="000000"/>
+            </w:tcBorders>
+          </w:tcPr>
+          <w:p>
+            <w:pPr>
+              <w:pStyle w:val="TableContents"/>
+              <w:jc w:val="center"/>
+              <w:rPr>
+                <w:rFonts w:ascii="Liberation Serif" w:hAnsi="Liberation Serif"/>
+                <w:b w:val="false"/>
+                <w:bCs w:val="false"/>
+                <w:i w:val="false"/>
+                <w:iCs w:val="false"/>
+                <w:strike w:val="false"/>
+                <w:dstrike w:val="false"/>
+                <w:outline w:val="false"/>
+                <w:shadow w:val="false"/>
+                <w:color w:val="000000"/>
+                <w:sz w:val="24"/>
+                <w:szCs w:val="24"/>
+                <w:u w:val="none"/>
+              </w:rPr>
+            </w:pPr>
+            <w:r>
+              <w:rPr>
+                <w:b w:val="false"/>
+                <w:bCs w:val="false"/>
+                <w:i w:val="false"/>
+                <w:iCs w:val="false"/>
+                <w:strike w:val="false"/>
+                <w:dstrike w:val="false"/>
+                <w:outline w:val="false"/>
+                <w:shadow w:val="false"/>
+                <w:color w:val="000000"/>
+                <w:sz w:val="24"/>
+                <w:szCs w:val="24"/>
+                <w:u w:val="none"/>
+              </w:rPr>
+              <w:t>Low-level controller</w:t>
+            </w:r>
+          </w:p>
+        </w:tc>
+        <w:tc>
+          <w:tcPr>
+            <w:tcW w:w="4819" w:type="dxa"/>
+            <w:tcBorders>
+              <w:start w:val="single" w:sz="4" w:space="0" w:color="000000"/>
+              <w:bottom w:val="single" w:sz="4" w:space="0" w:color="000000"/>
+              <w:end w:val="single" w:sz="4" w:space="0" w:color="000000"/>
+            </w:tcBorders>
+          </w:tcPr>
+          <w:p>
+            <w:pPr>
+              <w:pStyle w:val="TableContents"/>
+              <w:jc w:val="center"/>
+              <w:rPr>
+                <w:rFonts w:ascii="Liberation Serif" w:hAnsi="Liberation Serif"/>
+                <w:b w:val="false"/>
+                <w:bCs w:val="false"/>
+                <w:i w:val="false"/>
+                <w:iCs w:val="false"/>
+                <w:strike w:val="false"/>
+                <w:dstrike w:val="false"/>
+                <w:outline w:val="false"/>
+                <w:shadow w:val="false"/>
+                <w:color w:val="000000"/>
+                <w:sz w:val="24"/>
+                <w:szCs w:val="24"/>
+                <w:u w:val="none"/>
+              </w:rPr>
+            </w:pPr>
+            <w:r>
+              <w:rPr>
+                <w:b w:val="false"/>
+                <w:bCs w:val="false"/>
+                <w:i w:val="false"/>
+                <w:iCs w:val="false"/>
+                <w:strike w:val="false"/>
+                <w:dstrike w:val="false"/>
+                <w:outline w:val="false"/>
+                <w:shadow w:val="false"/>
+                <w:color w:val="000000"/>
+                <w:sz w:val="24"/>
+                <w:szCs w:val="24"/>
+                <w:u w:val="none"/>
+              </w:rPr>
+              <w:t>50,000</w:t>
+            </w:r>
+          </w:p>
+        </w:tc>
+      </w:tr>
+      <w:tr>
+        <w:trPr/>
+        <w:tc>
+          <w:tcPr>
+            <w:tcW w:w="4819" w:type="dxa"/>
+            <w:tcBorders>
+              <w:start w:val="single" w:sz="4" w:space="0" w:color="000000"/>
+              <w:bottom w:val="single" w:sz="4" w:space="0" w:color="000000"/>
+            </w:tcBorders>
+          </w:tcPr>
+          <w:p>
+            <w:pPr>
+              <w:pStyle w:val="TableContents"/>
+              <w:jc w:val="center"/>
+              <w:rPr>
+                <w:rFonts w:ascii="Liberation Serif" w:hAnsi="Liberation Serif"/>
+                <w:b w:val="false"/>
+                <w:bCs w:val="false"/>
+                <w:i w:val="false"/>
+                <w:iCs w:val="false"/>
+                <w:strike w:val="false"/>
+                <w:dstrike w:val="false"/>
+                <w:outline w:val="false"/>
+                <w:shadow w:val="false"/>
+                <w:color w:val="000000"/>
+                <w:sz w:val="24"/>
+                <w:szCs w:val="24"/>
+                <w:u w:val="none"/>
+              </w:rPr>
+            </w:pPr>
+            <w:r>
+              <w:rPr>
+                <w:b w:val="false"/>
+                <w:bCs w:val="false"/>
+                <w:i w:val="false"/>
+                <w:iCs w:val="false"/>
+                <w:strike w:val="false"/>
+                <w:dstrike w:val="false"/>
+                <w:outline w:val="false"/>
+                <w:shadow w:val="false"/>
+                <w:color w:val="000000"/>
+                <w:sz w:val="24"/>
+                <w:szCs w:val="24"/>
+                <w:u w:val="none"/>
+              </w:rPr>
+              <w:t>Raspberry Pi Camera</w:t>
+            </w:r>
+          </w:p>
+        </w:tc>
+        <w:tc>
+          <w:tcPr>
+            <w:tcW w:w="4819" w:type="dxa"/>
+            <w:tcBorders>
+              <w:start w:val="single" w:sz="4" w:space="0" w:color="000000"/>
+              <w:bottom w:val="single" w:sz="4" w:space="0" w:color="000000"/>
+              <w:end w:val="single" w:sz="4" w:space="0" w:color="000000"/>
+            </w:tcBorders>
+          </w:tcPr>
+          <w:p>
+            <w:pPr>
+              <w:pStyle w:val="TableContents"/>
+              <w:jc w:val="center"/>
+              <w:rPr>
+                <w:rFonts w:ascii="Liberation Serif" w:hAnsi="Liberation Serif"/>
+                <w:b w:val="false"/>
+                <w:bCs w:val="false"/>
+                <w:i w:val="false"/>
+                <w:iCs w:val="false"/>
+                <w:strike w:val="false"/>
+                <w:dstrike w:val="false"/>
+                <w:outline w:val="false"/>
+                <w:shadow w:val="false"/>
+                <w:color w:val="000000"/>
+                <w:sz w:val="24"/>
+                <w:szCs w:val="24"/>
+                <w:u w:val="none"/>
+              </w:rPr>
+            </w:pPr>
+            <w:r>
+              <w:rPr>
+                <w:b w:val="false"/>
+                <w:bCs w:val="false"/>
+                <w:i w:val="false"/>
+                <w:iCs w:val="false"/>
+                <w:strike w:val="false"/>
+                <w:dstrike w:val="false"/>
+                <w:outline w:val="false"/>
+                <w:shadow w:val="false"/>
+                <w:color w:val="000000"/>
+                <w:sz w:val="24"/>
+                <w:szCs w:val="24"/>
+                <w:u w:val="none"/>
+              </w:rPr>
+              <w:t>50,000</w:t>
+            </w:r>
+          </w:p>
+        </w:tc>
+      </w:tr>
+      <w:tr>
+        <w:trPr/>
+        <w:tc>
+          <w:tcPr>
+            <w:tcW w:w="4819" w:type="dxa"/>
+            <w:tcBorders>
+              <w:start w:val="single" w:sz="4" w:space="0" w:color="000000"/>
+              <w:bottom w:val="single" w:sz="4" w:space="0" w:color="000000"/>
+            </w:tcBorders>
+          </w:tcPr>
+          <w:p>
+            <w:pPr>
+              <w:pStyle w:val="TableContents"/>
+              <w:jc w:val="center"/>
+              <w:rPr>
+                <w:rFonts w:ascii="Liberation Serif" w:hAnsi="Liberation Serif"/>
+                <w:b w:val="false"/>
+                <w:bCs w:val="false"/>
+                <w:i w:val="false"/>
+                <w:iCs w:val="false"/>
+                <w:strike w:val="false"/>
+                <w:dstrike w:val="false"/>
+                <w:outline w:val="false"/>
+                <w:shadow w:val="false"/>
+                <w:color w:val="000000"/>
+                <w:sz w:val="24"/>
+                <w:szCs w:val="24"/>
+                <w:u w:val="none"/>
+              </w:rPr>
+            </w:pPr>
+            <w:r>
+              <w:rPr>
+                <w:b w:val="false"/>
+                <w:bCs w:val="false"/>
+                <w:i w:val="false"/>
+                <w:iCs w:val="false"/>
+                <w:strike w:val="false"/>
+                <w:dstrike w:val="false"/>
+                <w:outline w:val="false"/>
+                <w:shadow w:val="false"/>
+                <w:color w:val="000000"/>
+                <w:sz w:val="24"/>
+                <w:szCs w:val="24"/>
+                <w:u w:val="none"/>
+              </w:rPr>
+              <w:t>Keypad</w:t>
+            </w:r>
+          </w:p>
+        </w:tc>
+        <w:tc>
+          <w:tcPr>
+            <w:tcW w:w="4819" w:type="dxa"/>
+            <w:tcBorders>
+              <w:start w:val="single" w:sz="4" w:space="0" w:color="000000"/>
+              <w:bottom w:val="single" w:sz="4" w:space="0" w:color="000000"/>
+              <w:end w:val="single" w:sz="4" w:space="0" w:color="000000"/>
+            </w:tcBorders>
+          </w:tcPr>
+          <w:p>
+            <w:pPr>
+              <w:pStyle w:val="TableContents"/>
+              <w:jc w:val="center"/>
+              <w:rPr>
+                <w:rFonts w:ascii="Liberation Serif" w:hAnsi="Liberation Serif"/>
+                <w:b w:val="false"/>
+                <w:bCs w:val="false"/>
+                <w:i w:val="false"/>
+                <w:iCs w:val="false"/>
+                <w:strike w:val="false"/>
+                <w:dstrike w:val="false"/>
+                <w:outline w:val="false"/>
+                <w:shadow w:val="false"/>
+                <w:color w:val="000000"/>
+                <w:sz w:val="24"/>
+                <w:szCs w:val="24"/>
+                <w:u w:val="none"/>
+              </w:rPr>
+            </w:pPr>
+            <w:r>
+              <w:rPr>
+                <w:b w:val="false"/>
+                <w:bCs w:val="false"/>
+                <w:i w:val="false"/>
+                <w:iCs w:val="false"/>
+                <w:strike w:val="false"/>
+                <w:dstrike w:val="false"/>
+                <w:outline w:val="false"/>
+                <w:shadow w:val="false"/>
+                <w:color w:val="000000"/>
+                <w:sz w:val="24"/>
+                <w:szCs w:val="24"/>
+                <w:u w:val="none"/>
+              </w:rPr>
+              <w:t>15,000</w:t>
+            </w:r>
+          </w:p>
+        </w:tc>
+      </w:tr>
+      <w:tr>
+        <w:trPr/>
+        <w:tc>
+          <w:tcPr>
+            <w:tcW w:w="4819" w:type="dxa"/>
+            <w:tcBorders>
+              <w:start w:val="single" w:sz="4" w:space="0" w:color="000000"/>
+              <w:bottom w:val="single" w:sz="4" w:space="0" w:color="000000"/>
+            </w:tcBorders>
+          </w:tcPr>
+          <w:p>
+            <w:pPr>
+              <w:pStyle w:val="TableContents"/>
+              <w:jc w:val="center"/>
+              <w:rPr>
+                <w:rFonts w:ascii="Liberation Serif" w:hAnsi="Liberation Serif"/>
+                <w:b w:val="false"/>
+                <w:bCs w:val="false"/>
+                <w:i w:val="false"/>
+                <w:iCs w:val="false"/>
+                <w:strike w:val="false"/>
+                <w:dstrike w:val="false"/>
+                <w:outline w:val="false"/>
+                <w:shadow w:val="false"/>
+                <w:color w:val="000000"/>
+                <w:sz w:val="24"/>
+                <w:szCs w:val="24"/>
+                <w:u w:val="none"/>
+              </w:rPr>
+            </w:pPr>
+            <w:r>
+              <w:rPr>
+                <w:b w:val="false"/>
+                <w:bCs w:val="false"/>
+                <w:i w:val="false"/>
+                <w:iCs w:val="false"/>
+                <w:strike w:val="false"/>
+                <w:dstrike w:val="false"/>
+                <w:outline w:val="false"/>
+                <w:shadow w:val="false"/>
+                <w:color w:val="000000"/>
+                <w:sz w:val="24"/>
+                <w:szCs w:val="24"/>
+                <w:u w:val="none"/>
+              </w:rPr>
+              <w:t>LCD Display</w:t>
+            </w:r>
+          </w:p>
+        </w:tc>
+        <w:tc>
+          <w:tcPr>
+            <w:tcW w:w="4819" w:type="dxa"/>
+            <w:tcBorders>
+              <w:start w:val="single" w:sz="4" w:space="0" w:color="000000"/>
+              <w:bottom w:val="single" w:sz="4" w:space="0" w:color="000000"/>
+              <w:end w:val="single" w:sz="4" w:space="0" w:color="000000"/>
+            </w:tcBorders>
+          </w:tcPr>
+          <w:p>
+            <w:pPr>
+              <w:pStyle w:val="TableContents"/>
+              <w:jc w:val="center"/>
+              <w:rPr>
+                <w:rFonts w:ascii="Liberation Serif" w:hAnsi="Liberation Serif"/>
+                <w:b w:val="false"/>
+                <w:bCs w:val="false"/>
+                <w:i w:val="false"/>
+                <w:iCs w:val="false"/>
+                <w:strike w:val="false"/>
+                <w:dstrike w:val="false"/>
+                <w:outline w:val="false"/>
+                <w:shadow w:val="false"/>
+                <w:color w:val="000000"/>
+                <w:sz w:val="24"/>
+                <w:szCs w:val="24"/>
+                <w:u w:val="none"/>
+              </w:rPr>
+            </w:pPr>
+            <w:r>
+              <w:rPr>
+                <w:b w:val="false"/>
+                <w:bCs w:val="false"/>
+                <w:i w:val="false"/>
+                <w:iCs w:val="false"/>
+                <w:strike w:val="false"/>
+                <w:dstrike w:val="false"/>
+                <w:outline w:val="false"/>
+                <w:shadow w:val="false"/>
+                <w:color w:val="000000"/>
+                <w:sz w:val="24"/>
+                <w:szCs w:val="24"/>
+                <w:u w:val="none"/>
+              </w:rPr>
+              <w:t>20,000</w:t>
+            </w:r>
+          </w:p>
+        </w:tc>
+      </w:tr>
+      <w:tr>
+        <w:trPr/>
+        <w:tc>
+          <w:tcPr>
+            <w:tcW w:w="4819" w:type="dxa"/>
+            <w:tcBorders>
+              <w:start w:val="single" w:sz="4" w:space="0" w:color="000000"/>
+              <w:bottom w:val="single" w:sz="4" w:space="0" w:color="000000"/>
+            </w:tcBorders>
+          </w:tcPr>
+          <w:p>
+            <w:pPr>
+              <w:pStyle w:val="TableContents"/>
+              <w:jc w:val="center"/>
+              <w:rPr>
+                <w:rFonts w:ascii="Liberation Serif" w:hAnsi="Liberation Serif"/>
+                <w:b w:val="false"/>
+                <w:bCs w:val="false"/>
+                <w:i w:val="false"/>
+                <w:iCs w:val="false"/>
+                <w:strike w:val="false"/>
+                <w:dstrike w:val="false"/>
+                <w:outline w:val="false"/>
+                <w:shadow w:val="false"/>
+                <w:color w:val="000000"/>
+                <w:sz w:val="24"/>
+                <w:szCs w:val="24"/>
+                <w:u w:val="none"/>
+              </w:rPr>
+            </w:pPr>
+            <w:r>
+              <w:rPr>
+                <w:b w:val="false"/>
+                <w:bCs w:val="false"/>
+                <w:i w:val="false"/>
+                <w:iCs w:val="false"/>
+                <w:strike w:val="false"/>
+                <w:dstrike w:val="false"/>
+                <w:outline w:val="false"/>
+                <w:shadow w:val="false"/>
+                <w:color w:val="000000"/>
+                <w:sz w:val="24"/>
+                <w:szCs w:val="24"/>
+                <w:u w:val="none"/>
+              </w:rPr>
+              <w:t>Actuators (motors, mechanical parts)</w:t>
+            </w:r>
+          </w:p>
+        </w:tc>
+        <w:tc>
+          <w:tcPr>
+            <w:tcW w:w="4819" w:type="dxa"/>
+            <w:tcBorders>
+              <w:start w:val="single" w:sz="4" w:space="0" w:color="000000"/>
+              <w:bottom w:val="single" w:sz="4" w:space="0" w:color="000000"/>
+              <w:end w:val="single" w:sz="4" w:space="0" w:color="000000"/>
+            </w:tcBorders>
+          </w:tcPr>
+          <w:p>
+            <w:pPr>
+              <w:pStyle w:val="TableContents"/>
+              <w:jc w:val="center"/>
+              <w:rPr>
+                <w:rFonts w:ascii="Liberation Serif" w:hAnsi="Liberation Serif"/>
+                <w:b w:val="false"/>
+                <w:bCs w:val="false"/>
+                <w:i w:val="false"/>
+                <w:iCs w:val="false"/>
+                <w:strike w:val="false"/>
+                <w:dstrike w:val="false"/>
+                <w:outline w:val="false"/>
+                <w:shadow w:val="false"/>
+                <w:color w:val="000000"/>
+                <w:sz w:val="24"/>
+                <w:szCs w:val="24"/>
+                <w:u w:val="none"/>
+              </w:rPr>
+            </w:pPr>
+            <w:r>
+              <w:rPr>
+                <w:b w:val="false"/>
+                <w:bCs w:val="false"/>
+                <w:i w:val="false"/>
+                <w:iCs w:val="false"/>
+                <w:strike w:val="false"/>
+                <w:dstrike w:val="false"/>
+                <w:outline w:val="false"/>
+                <w:shadow w:val="false"/>
+                <w:color w:val="000000"/>
+                <w:sz w:val="24"/>
+                <w:szCs w:val="24"/>
+                <w:u w:val="none"/>
+              </w:rPr>
+              <w:t>5</w:t>
+            </w:r>
+            <w:r>
+              <w:rPr>
+                <w:b w:val="false"/>
+                <w:bCs w:val="false"/>
+                <w:i w:val="false"/>
+                <w:iCs w:val="false"/>
+                <w:strike w:val="false"/>
+                <w:dstrike w:val="false"/>
+                <w:outline w:val="false"/>
+                <w:shadow w:val="false"/>
+                <w:color w:val="000000"/>
+                <w:sz w:val="24"/>
+                <w:szCs w:val="24"/>
+                <w:u w:val="none"/>
+              </w:rPr>
+              <w:t>0,000</w:t>
+            </w:r>
+          </w:p>
+        </w:tc>
+      </w:tr>
+      <w:tr>
+        <w:trPr/>
+        <w:tc>
+          <w:tcPr>
+            <w:tcW w:w="4819" w:type="dxa"/>
+            <w:tcBorders>
+              <w:start w:val="single" w:sz="4" w:space="0" w:color="000000"/>
+              <w:bottom w:val="single" w:sz="4" w:space="0" w:color="000000"/>
+            </w:tcBorders>
+          </w:tcPr>
+          <w:p>
+            <w:pPr>
+              <w:pStyle w:val="TableContents"/>
+              <w:jc w:val="center"/>
+              <w:rPr>
+                <w:rFonts w:ascii="Liberation Serif" w:hAnsi="Liberation Serif"/>
+                <w:b w:val="false"/>
+                <w:bCs w:val="false"/>
+                <w:i w:val="false"/>
+                <w:iCs w:val="false"/>
+                <w:strike w:val="false"/>
+                <w:dstrike w:val="false"/>
+                <w:outline w:val="false"/>
+                <w:shadow w:val="false"/>
+                <w:color w:val="000000"/>
+                <w:sz w:val="24"/>
+                <w:szCs w:val="24"/>
+                <w:u w:val="none"/>
+              </w:rPr>
+            </w:pPr>
+            <w:r>
+              <w:rPr>
+                <w:b w:val="false"/>
+                <w:bCs w:val="false"/>
+                <w:i w:val="false"/>
+                <w:iCs w:val="false"/>
+                <w:strike w:val="false"/>
+                <w:dstrike w:val="false"/>
+                <w:outline w:val="false"/>
+                <w:shadow w:val="false"/>
+                <w:color w:val="000000"/>
+                <w:sz w:val="24"/>
+                <w:szCs w:val="24"/>
+                <w:u w:val="none"/>
+              </w:rPr>
+              <w:t>Sensors (limit switches, optical)</w:t>
+            </w:r>
+          </w:p>
+        </w:tc>
+        <w:tc>
+          <w:tcPr>
+            <w:tcW w:w="4819" w:type="dxa"/>
+            <w:tcBorders>
+              <w:start w:val="single" w:sz="4" w:space="0" w:color="000000"/>
+              <w:bottom w:val="single" w:sz="4" w:space="0" w:color="000000"/>
+              <w:end w:val="single" w:sz="4" w:space="0" w:color="000000"/>
+            </w:tcBorders>
+          </w:tcPr>
+          <w:p>
+            <w:pPr>
+              <w:pStyle w:val="TableContents"/>
+              <w:jc w:val="center"/>
+              <w:rPr>
+                <w:rFonts w:ascii="Liberation Serif" w:hAnsi="Liberation Serif"/>
+                <w:b w:val="false"/>
+                <w:bCs w:val="false"/>
+                <w:i w:val="false"/>
+                <w:iCs w:val="false"/>
+                <w:strike w:val="false"/>
+                <w:dstrike w:val="false"/>
+                <w:outline w:val="false"/>
+                <w:shadow w:val="false"/>
+                <w:color w:val="000000"/>
+                <w:sz w:val="24"/>
+                <w:szCs w:val="24"/>
+                <w:u w:val="none"/>
+              </w:rPr>
+            </w:pPr>
+            <w:r>
+              <w:rPr>
+                <w:b w:val="false"/>
+                <w:bCs w:val="false"/>
+                <w:i w:val="false"/>
+                <w:iCs w:val="false"/>
+                <w:strike w:val="false"/>
+                <w:dstrike w:val="false"/>
+                <w:outline w:val="false"/>
+                <w:shadow w:val="false"/>
+                <w:color w:val="000000"/>
+                <w:sz w:val="24"/>
+                <w:szCs w:val="24"/>
+                <w:u w:val="none"/>
+              </w:rPr>
+              <w:t>3</w:t>
+            </w:r>
+            <w:r>
+              <w:rPr>
+                <w:b w:val="false"/>
+                <w:bCs w:val="false"/>
+                <w:i w:val="false"/>
+                <w:iCs w:val="false"/>
+                <w:strike w:val="false"/>
+                <w:dstrike w:val="false"/>
+                <w:outline w:val="false"/>
+                <w:shadow w:val="false"/>
+                <w:color w:val="000000"/>
+                <w:sz w:val="24"/>
+                <w:szCs w:val="24"/>
+                <w:u w:val="none"/>
+              </w:rPr>
+              <w:t>0,000</w:t>
+            </w:r>
+          </w:p>
+        </w:tc>
+      </w:tr>
+      <w:tr>
+        <w:trPr/>
+        <w:tc>
+          <w:tcPr>
+            <w:tcW w:w="4819" w:type="dxa"/>
+            <w:tcBorders>
+              <w:start w:val="single" w:sz="4" w:space="0" w:color="000000"/>
+              <w:bottom w:val="single" w:sz="4" w:space="0" w:color="000000"/>
+            </w:tcBorders>
+          </w:tcPr>
+          <w:p>
+            <w:pPr>
+              <w:pStyle w:val="TableContents"/>
+              <w:jc w:val="center"/>
+              <w:rPr>
+                <w:rFonts w:ascii="Liberation Serif" w:hAnsi="Liberation Serif"/>
+                <w:b w:val="false"/>
+                <w:bCs w:val="false"/>
+                <w:i w:val="false"/>
+                <w:iCs w:val="false"/>
+                <w:strike w:val="false"/>
+                <w:dstrike w:val="false"/>
+                <w:outline w:val="false"/>
+                <w:shadow w:val="false"/>
+                <w:color w:val="000000"/>
+                <w:sz w:val="24"/>
+                <w:szCs w:val="24"/>
+                <w:u w:val="none"/>
+              </w:rPr>
+            </w:pPr>
+            <w:r>
+              <w:rPr>
+                <w:b w:val="false"/>
+                <w:bCs w:val="false"/>
+                <w:i w:val="false"/>
+                <w:iCs w:val="false"/>
+                <w:strike w:val="false"/>
+                <w:dstrike w:val="false"/>
+                <w:outline w:val="false"/>
+                <w:shadow w:val="false"/>
+                <w:color w:val="000000"/>
+                <w:sz w:val="24"/>
+                <w:szCs w:val="24"/>
+                <w:u w:val="none"/>
+              </w:rPr>
+              <w:t>GSM Module</w:t>
+            </w:r>
+          </w:p>
+        </w:tc>
+        <w:tc>
+          <w:tcPr>
+            <w:tcW w:w="4819" w:type="dxa"/>
+            <w:tcBorders>
+              <w:start w:val="single" w:sz="4" w:space="0" w:color="000000"/>
+              <w:bottom w:val="single" w:sz="4" w:space="0" w:color="000000"/>
+              <w:end w:val="single" w:sz="4" w:space="0" w:color="000000"/>
+            </w:tcBorders>
+          </w:tcPr>
+          <w:p>
+            <w:pPr>
+              <w:pStyle w:val="TableContents"/>
+              <w:jc w:val="center"/>
+              <w:rPr>
+                <w:rFonts w:ascii="Liberation Serif" w:hAnsi="Liberation Serif"/>
+                <w:b w:val="false"/>
+                <w:bCs w:val="false"/>
+                <w:i w:val="false"/>
+                <w:iCs w:val="false"/>
+                <w:strike w:val="false"/>
+                <w:dstrike w:val="false"/>
+                <w:outline w:val="false"/>
+                <w:shadow w:val="false"/>
+                <w:color w:val="000000"/>
+                <w:sz w:val="24"/>
+                <w:szCs w:val="24"/>
+                <w:u w:val="none"/>
+              </w:rPr>
+            </w:pPr>
+            <w:r>
+              <w:rPr>
+                <w:b w:val="false"/>
+                <w:bCs w:val="false"/>
+                <w:i w:val="false"/>
+                <w:iCs w:val="false"/>
+                <w:strike w:val="false"/>
+                <w:dstrike w:val="false"/>
+                <w:outline w:val="false"/>
+                <w:shadow w:val="false"/>
+                <w:color w:val="000000"/>
+                <w:sz w:val="24"/>
+                <w:szCs w:val="24"/>
+                <w:u w:val="none"/>
+              </w:rPr>
+              <w:t>35,000</w:t>
+            </w:r>
+          </w:p>
+        </w:tc>
+      </w:tr>
+      <w:tr>
+        <w:trPr/>
+        <w:tc>
+          <w:tcPr>
+            <w:tcW w:w="4819" w:type="dxa"/>
+            <w:tcBorders>
+              <w:start w:val="single" w:sz="4" w:space="0" w:color="000000"/>
+              <w:bottom w:val="single" w:sz="4" w:space="0" w:color="000000"/>
+            </w:tcBorders>
+          </w:tcPr>
+          <w:p>
+            <w:pPr>
+              <w:pStyle w:val="TableContents"/>
+              <w:jc w:val="center"/>
+              <w:rPr>
+                <w:rFonts w:ascii="Liberation Serif" w:hAnsi="Liberation Serif"/>
+                <w:b/>
+                <w:bCs/>
+                <w:i w:val="false"/>
+                <w:iCs w:val="false"/>
+                <w:strike w:val="false"/>
+                <w:dstrike w:val="false"/>
+                <w:outline w:val="false"/>
+                <w:shadow w:val="false"/>
+                <w:color w:val="000000"/>
+                <w:sz w:val="24"/>
+                <w:szCs w:val="24"/>
+                <w:u w:val="none"/>
+              </w:rPr>
+            </w:pPr>
+            <w:r>
+              <w:rPr>
+                <w:b/>
+                <w:bCs/>
+                <w:i w:val="false"/>
+                <w:iCs w:val="false"/>
+                <w:strike w:val="false"/>
+                <w:dstrike w:val="false"/>
+                <w:outline w:val="false"/>
+                <w:shadow w:val="false"/>
+                <w:color w:val="000000"/>
+                <w:sz w:val="24"/>
+                <w:szCs w:val="24"/>
+                <w:u w:val="none"/>
+              </w:rPr>
+              <w:t>TOTAL</w:t>
+            </w:r>
+          </w:p>
+        </w:tc>
+        <w:tc>
+          <w:tcPr>
+            <w:tcW w:w="4819" w:type="dxa"/>
+            <w:tcBorders>
+              <w:start w:val="single" w:sz="4" w:space="0" w:color="000000"/>
+              <w:bottom w:val="single" w:sz="4" w:space="0" w:color="000000"/>
+              <w:end w:val="single" w:sz="4" w:space="0" w:color="000000"/>
+            </w:tcBorders>
+          </w:tcPr>
+          <w:p>
+            <w:pPr>
+              <w:pStyle w:val="TableContents"/>
+              <w:jc w:val="center"/>
+              <w:rPr>
+                <w:rFonts w:ascii="Liberation Serif" w:hAnsi="Liberation Serif"/>
+                <w:b/>
+                <w:bCs/>
+                <w:i w:val="false"/>
+                <w:iCs w:val="false"/>
+                <w:strike w:val="false"/>
+                <w:dstrike w:val="false"/>
+                <w:outline w:val="false"/>
+                <w:shadow w:val="false"/>
+                <w:color w:val="000000"/>
+                <w:sz w:val="24"/>
+                <w:szCs w:val="24"/>
+                <w:u w:val="none"/>
+              </w:rPr>
+            </w:pPr>
+            <w:r>
+              <w:rPr>
+                <w:b/>
+                <w:bCs/>
+                <w:i w:val="false"/>
+                <w:iCs w:val="false"/>
+                <w:strike w:val="false"/>
+                <w:dstrike w:val="false"/>
+                <w:outline w:val="false"/>
+                <w:shadow w:val="false"/>
+                <w:color w:val="000000"/>
+                <w:sz w:val="24"/>
+                <w:szCs w:val="24"/>
+                <w:u w:val="none"/>
+              </w:rPr>
+              <w:t>450,000</w:t>
+            </w:r>
+          </w:p>
+        </w:tc>
+      </w:tr>
+    </w:tbl>
+    <w:p>
+      <w:pPr>
+        <w:pStyle w:val="BodyText"/>
+        <w:rPr/>
+      </w:pPr>
+      <w:r>
+        <w:rPr/>
       </w:r>
       <w:r>
         <w:br w:type="page"/>
@@ -2636,8 +4109,8 @@
         <w:ind w:hanging="0" w:start="0"/>
         <w:rPr/>
       </w:pPr>
-      <w:bookmarkStart w:id="19" w:name="__RefHeading___Toc2934_3810426074"/>
-      <w:bookmarkEnd w:id="19"/>
+      <w:bookmarkStart w:id="22" w:name="__RefHeading___Toc2934_3810426074"/>
+      <w:bookmarkEnd w:id="22"/>
       <w:r>
         <w:rPr/>
         <w:t>REFERENCES</w:t>
@@ -2670,7 +4143,7 @@
         <w:rPr/>
         <w:t xml:space="preserve">Aman Prasad, Shraddha Kumar, Keshav Shriram, Prof. Dr. Vikram Mane, “IOT Based Pen Vending Machine”, Published in International Research Journal of Innovations in Engineering and Technology - IRJIET, Volume 8, Issue 3, pp 367-373, March 2024. Article DOI </w:t>
       </w:r>
-      <w:hyperlink r:id="rId6">
+      <w:hyperlink r:id="rId9">
         <w:r>
           <w:rPr>
             <w:rStyle w:val="Hyperlink"/>
@@ -2729,9 +4202,9 @@
       </w:r>
     </w:p>
     <w:sectPr>
-      <w:footerReference w:type="even" r:id="rId7"/>
-      <w:footerReference w:type="default" r:id="rId8"/>
-      <w:footerReference w:type="first" r:id="rId9"/>
+      <w:footerReference w:type="even" r:id="rId10"/>
+      <w:footerReference w:type="default" r:id="rId11"/>
+      <w:footerReference w:type="first" r:id="rId12"/>
       <w:type w:val="nextPage"/>
       <w:pgSz w:w="11906" w:h="16838"/>
       <w:pgMar w:left="1134" w:right="1134" w:gutter="0" w:header="0" w:top="1134" w:footer="1134" w:bottom="1693"/>
@@ -2850,7 +4323,7 @@
       <w:jc w:val="center"/>
       <w:rPr/>
     </w:pPr>
-    <w:bookmarkStart w:id="20" w:name="PageNumWizard_FOOTER_Index1"/>
+    <w:bookmarkStart w:id="23" w:name="PageNumWizard_FOOTER_Index1"/>
     <w:r>
       <w:rPr/>
       <w:fldChar w:fldCharType="begin"/>
@@ -2865,13 +4338,13 @@
     </w:r>
     <w:r>
       <w:rPr/>
-      <w:t>7</w:t>
+      <w:t>8</w:t>
     </w:r>
     <w:r>
       <w:rPr/>
       <w:fldChar w:fldCharType="end"/>
     </w:r>
-    <w:bookmarkEnd w:id="20"/>
+    <w:bookmarkEnd w:id="23"/>
   </w:p>
 </w:ftr>
 </file>
@@ -2884,7 +4357,7 @@
       <w:jc w:val="center"/>
       <w:rPr/>
     </w:pPr>
-    <w:bookmarkStart w:id="21" w:name="PageNumWizard_FOOTER_Index1"/>
+    <w:bookmarkStart w:id="24" w:name="PageNumWizard_FOOTER_Index1"/>
     <w:r>
       <w:rPr/>
       <w:fldChar w:fldCharType="begin"/>
@@ -2899,13 +4372,13 @@
     </w:r>
     <w:r>
       <w:rPr/>
-      <w:t>7</w:t>
+      <w:t>8</w:t>
     </w:r>
     <w:r>
       <w:rPr/>
       <w:fldChar w:fldCharType="end"/>
     </w:r>
-    <w:bookmarkEnd w:id="21"/>
+    <w:bookmarkEnd w:id="24"/>
   </w:p>
 </w:ftr>
 </file>
@@ -3845,6 +5318,143 @@
     </w:lvl>
   </w:abstractNum>
   <w:abstractNum w:abstractNumId="8">
+    <w:lvl w:ilvl="0">
+      <w:start w:val="1"/>
+      <w:numFmt w:val="bullet"/>
+      <w:lvlText w:val=""/>
+      <w:lvlJc w:val="start"/>
+      <w:pPr>
+        <w:tabs>
+          <w:tab w:val="num" w:pos="720"/>
+        </w:tabs>
+        <w:ind w:start="720" w:hanging="360"/>
+      </w:pPr>
+      <w:rPr>
+        <w:rFonts w:ascii="Symbol" w:hAnsi="Symbol" w:cs="Symbol" w:hint="default"/>
+      </w:rPr>
+    </w:lvl>
+    <w:lvl w:ilvl="1">
+      <w:start w:val="1"/>
+      <w:numFmt w:val="bullet"/>
+      <w:lvlText w:val=""/>
+      <w:lvlJc w:val="start"/>
+      <w:pPr>
+        <w:tabs>
+          <w:tab w:val="num" w:pos="1080"/>
+        </w:tabs>
+        <w:ind w:start="1080" w:hanging="360"/>
+      </w:pPr>
+      <w:rPr>
+        <w:rFonts w:ascii="Symbol" w:hAnsi="Symbol" w:cs="Symbol" w:hint="default"/>
+      </w:rPr>
+    </w:lvl>
+    <w:lvl w:ilvl="2">
+      <w:start w:val="1"/>
+      <w:numFmt w:val="bullet"/>
+      <w:lvlText w:val=""/>
+      <w:lvlJc w:val="start"/>
+      <w:pPr>
+        <w:tabs>
+          <w:tab w:val="num" w:pos="1440"/>
+        </w:tabs>
+        <w:ind w:start="1440" w:hanging="360"/>
+      </w:pPr>
+      <w:rPr>
+        <w:rFonts w:ascii="Symbol" w:hAnsi="Symbol" w:cs="Symbol" w:hint="default"/>
+      </w:rPr>
+    </w:lvl>
+    <w:lvl w:ilvl="3">
+      <w:start w:val="1"/>
+      <w:numFmt w:val="bullet"/>
+      <w:lvlText w:val=""/>
+      <w:lvlJc w:val="start"/>
+      <w:pPr>
+        <w:tabs>
+          <w:tab w:val="num" w:pos="1800"/>
+        </w:tabs>
+        <w:ind w:start="1800" w:hanging="360"/>
+      </w:pPr>
+      <w:rPr>
+        <w:rFonts w:ascii="Symbol" w:hAnsi="Symbol" w:cs="Symbol" w:hint="default"/>
+      </w:rPr>
+    </w:lvl>
+    <w:lvl w:ilvl="4">
+      <w:start w:val="1"/>
+      <w:numFmt w:val="bullet"/>
+      <w:lvlText w:val=""/>
+      <w:lvlJc w:val="start"/>
+      <w:pPr>
+        <w:tabs>
+          <w:tab w:val="num" w:pos="2160"/>
+        </w:tabs>
+        <w:ind w:start="2160" w:hanging="360"/>
+      </w:pPr>
+      <w:rPr>
+        <w:rFonts w:ascii="Symbol" w:hAnsi="Symbol" w:cs="Symbol" w:hint="default"/>
+      </w:rPr>
+    </w:lvl>
+    <w:lvl w:ilvl="5">
+      <w:start w:val="1"/>
+      <w:numFmt w:val="bullet"/>
+      <w:lvlText w:val=""/>
+      <w:lvlJc w:val="start"/>
+      <w:pPr>
+        <w:tabs>
+          <w:tab w:val="num" w:pos="2520"/>
+        </w:tabs>
+        <w:ind w:start="2520" w:hanging="360"/>
+      </w:pPr>
+      <w:rPr>
+        <w:rFonts w:ascii="Symbol" w:hAnsi="Symbol" w:cs="Symbol" w:hint="default"/>
+      </w:rPr>
+    </w:lvl>
+    <w:lvl w:ilvl="6">
+      <w:start w:val="1"/>
+      <w:numFmt w:val="bullet"/>
+      <w:lvlText w:val=""/>
+      <w:lvlJc w:val="start"/>
+      <w:pPr>
+        <w:tabs>
+          <w:tab w:val="num" w:pos="2880"/>
+        </w:tabs>
+        <w:ind w:start="2880" w:hanging="360"/>
+      </w:pPr>
+      <w:rPr>
+        <w:rFonts w:ascii="Symbol" w:hAnsi="Symbol" w:cs="Symbol" w:hint="default"/>
+      </w:rPr>
+    </w:lvl>
+    <w:lvl w:ilvl="7">
+      <w:start w:val="1"/>
+      <w:numFmt w:val="bullet"/>
+      <w:lvlText w:val=""/>
+      <w:lvlJc w:val="start"/>
+      <w:pPr>
+        <w:tabs>
+          <w:tab w:val="num" w:pos="3240"/>
+        </w:tabs>
+        <w:ind w:start="3240" w:hanging="360"/>
+      </w:pPr>
+      <w:rPr>
+        <w:rFonts w:ascii="Symbol" w:hAnsi="Symbol" w:cs="Symbol" w:hint="default"/>
+      </w:rPr>
+    </w:lvl>
+    <w:lvl w:ilvl="8">
+      <w:start w:val="1"/>
+      <w:numFmt w:val="bullet"/>
+      <w:lvlText w:val=""/>
+      <w:lvlJc w:val="start"/>
+      <w:pPr>
+        <w:tabs>
+          <w:tab w:val="num" w:pos="3600"/>
+        </w:tabs>
+        <w:ind w:start="3600" w:hanging="360"/>
+      </w:pPr>
+      <w:rPr>
+        <w:rFonts w:ascii="Symbol" w:hAnsi="Symbol" w:cs="Symbol" w:hint="default"/>
+      </w:rPr>
+    </w:lvl>
+  </w:abstractNum>
+  <w:abstractNum w:abstractNumId="9">
     <w:lvl w:ilvl="0">
       <w:start w:val="1"/>
       <w:numFmt w:val="none"/>
@@ -3986,6 +5596,9 @@
   </w:num>
   <w:num w:numId="8">
     <w:abstractNumId w:val="8"/>
+  </w:num>
+  <w:num w:numId="9">
+    <w:abstractNumId w:val="9"/>
   </w:num>
 </w:numbering>
 </file>
@@ -4090,6 +5703,13 @@
   </w:style>
   <w:style w:type="character" w:styleId="Bulletsuser">
     <w:name w:val="Bullets (user)"/>
+    <w:qFormat/>
+    <w:rPr>
+      <w:rFonts w:ascii="OpenSymbol" w:hAnsi="OpenSymbol" w:eastAsia="OpenSymbol" w:cs="OpenSymbol"/>
+    </w:rPr>
+  </w:style>
+  <w:style w:type="character" w:styleId="Bullets">
+    <w:name w:val="Bullets"/>
     <w:qFormat/>
     <w:rPr>
       <w:rFonts w:ascii="OpenSymbol" w:hAnsi="OpenSymbol" w:eastAsia="OpenSymbol" w:cs="OpenSymbol"/>

</xml_diff>